<commit_message>
Integrate upstream real-time SPC charts (cabb82e)
Source: aebonlee/data10-01@cabb82e77a475ecffcddb3b21f8dc91cb3281a3f
Retain HD corporate colors and the two-hour press sample.
Record direct equipment connection as the chosen direction; actual connection and normal limits remain to be confirmed.
</commit_message>
<xml_diff>
--- a/docs/01_프로젝트_기획서.docx
+++ b/docs/01_프로젝트_기획서.docx
@@ -201,7 +201,7 @@
                 <w:rFonts w:ascii="맑은 고딕" w:hAnsi="맑은 고딕" w:eastAsia="맑은 고딕"/>
                 <w:sz w:val="18"/>
               </w:rPr>
-              <w:t>2026-10-20</w:t>
+              <w:t>2026-10-20 (v0.1) · 2026-10-21 (v0.2)</w:t>
             </w:r>
           </w:p>
         </w:tc>
@@ -231,7 +231,7 @@
                 <w:rFonts w:ascii="맑은 고딕" w:hAnsi="맑은 고딕" w:eastAsia="맑은 고딕"/>
                 <w:sz w:val="18"/>
               </w:rPr>
-              <w:t>초안 v0.1 — 수강생 제출 자료 기반</w:t>
+              <w:t>v0.2 — 2차 반영(수강생 로그 샘플·±3σ 관리도 요청, 11장)</w:t>
             </w:r>
           </w:p>
         </w:tc>
@@ -711,7 +711,7 @@
                 <w:rFonts w:ascii="맑은 고딕" w:hAnsi="맑은 고딕" w:eastAsia="맑은 고딕"/>
                 <w:sz w:val="18"/>
               </w:rPr>
-              <w:t>프레스 로그 — 프레스 종류·금형명·프레스 누적 타수·금형 타수·가동 시간·전류·전압·온도</w:t>
+              <w:t>프레스 센서 로그 — 일자(초까지)·프레스·프레스 종류·금형명·프레스 누적 타수·금형 타수·전류(A)·전압(V)·온도(℃)·진동(mm/s)</w:t>
             </w:r>
           </w:p>
         </w:tc>
@@ -725,7 +725,15 @@
                 <w:rFonts w:ascii="맑은 고딕" w:hAnsi="맑은 고딕" w:eastAsia="맑은 고딕"/>
                 <w:sz w:val="18"/>
               </w:rPr>
-              <w:t>미상(PLC·설비 화면·수기 엑셀 가운데 무엇인지 확인 필요)</w:t>
+              <w:t xml:space="preserve">CSV(UTF-8, 모든 칸 따옴표) — </w:t>
+            </w:r>
+            <w:r>
+              <w:rPr>
+                <w:rFonts w:ascii="맑은 고딕" w:hAnsi="맑은 고딕" w:eastAsia="맑은 고딕"/>
+                <w:b/>
+                <w:sz w:val="18"/>
+              </w:rPr>
+              <w:t>2차에 받은 모의 로그 형식</w:t>
             </w:r>
           </w:p>
         </w:tc>
@@ -739,7 +747,7 @@
                 <w:rFonts w:ascii="맑은 고딕" w:hAnsi="맑은 고딕" w:eastAsia="맑은 고딕"/>
                 <w:sz w:val="18"/>
               </w:rPr>
-              <w:t>미상</w:t>
+              <w:t>센서 값 2초마다, 타수는 10초에 1타 → 프레스 1대 하루 43,200행</w:t>
             </w:r>
           </w:p>
         </w:tc>
@@ -753,7 +761,7 @@
                 <w:rFonts w:ascii="맑은 고딕" w:hAnsi="맑은 고딕" w:eastAsia="맑은 고딕"/>
                 <w:sz w:val="18"/>
               </w:rPr>
-              <w:t>댓글 ⑦ 「올릴 수 있는 샘플」. 설비 운전 값이라 개인정보는 없을 것으로 보임(가정)</w:t>
+              <w:t>설비 운전 값이라 개인정보 없음. 받은 것은 수강생이 만든 모의 데이터(2시간·1대)</w:t>
             </w:r>
           </w:p>
         </w:tc>
@@ -783,7 +791,117 @@
                 <w:rFonts w:ascii="맑은 고딕" w:hAnsi="맑은 고딕" w:eastAsia="맑은 고딕"/>
                 <w:sz w:val="18"/>
               </w:rPr>
-              <w:t>미상</w:t>
+              <w:t>위 로그의 「진동(mm/s)」 칸</w:t>
+            </w:r>
+          </w:p>
+        </w:tc>
+        <w:tc>
+          <w:tcPr>
+            <w:tcW w:type="dxa" w:w="2160"/>
+          </w:tcPr>
+          <w:p>
+            <w:r>
+              <w:rPr>
+                <w:rFonts w:ascii="맑은 고딕" w:hAnsi="맑은 고딕" w:eastAsia="맑은 고딕"/>
+                <w:sz w:val="18"/>
+              </w:rPr>
+              <w:t>2초</w:t>
+            </w:r>
+          </w:p>
+        </w:tc>
+        <w:tc>
+          <w:tcPr>
+            <w:tcW w:type="dxa" w:w="2160"/>
+          </w:tcPr>
+          <w:p>
+            <w:r>
+              <w:rPr>
+                <w:rFonts w:ascii="맑은 고딕" w:hAnsi="맑은 고딕" w:eastAsia="맑은 고딕"/>
+                <w:sz w:val="18"/>
+              </w:rPr>
+              <w:t>2차에 확인 — RMS 인지 피크인지는 확인 필요</w:t>
+            </w:r>
+          </w:p>
+        </w:tc>
+      </w:tr>
+      <w:tr>
+        <w:tc>
+          <w:tcPr>
+            <w:tcW w:type="dxa" w:w="2160"/>
+          </w:tcPr>
+          <w:p>
+            <w:r>
+              <w:rPr>
+                <w:rFonts w:ascii="맑은 고딕" w:hAnsi="맑은 고딕" w:eastAsia="맑은 고딕"/>
+                <w:sz w:val="18"/>
+              </w:rPr>
+              <w:t>금형 타수</w:t>
+            </w:r>
+          </w:p>
+        </w:tc>
+        <w:tc>
+          <w:tcPr>
+            <w:tcW w:type="dxa" w:w="2160"/>
+          </w:tcPr>
+          <w:p>
+            <w:r>
+              <w:rPr>
+                <w:rFonts w:ascii="맑은 고딕" w:hAnsi="맑은 고딕" w:eastAsia="맑은 고딕"/>
+                <w:sz w:val="18"/>
+              </w:rPr>
+              <w:t>위 로그의 「금형 타수」 칸</w:t>
+            </w:r>
+          </w:p>
+        </w:tc>
+        <w:tc>
+          <w:tcPr>
+            <w:tcW w:type="dxa" w:w="2160"/>
+          </w:tcPr>
+          <w:p>
+            <w:r>
+              <w:rPr>
+                <w:rFonts w:ascii="맑은 고딕" w:hAnsi="맑은 고딕" w:eastAsia="맑은 고딕"/>
+                <w:sz w:val="18"/>
+              </w:rPr>
+              <w:t>—</w:t>
+            </w:r>
+          </w:p>
+        </w:tc>
+        <w:tc>
+          <w:tcPr>
+            <w:tcW w:type="dxa" w:w="2160"/>
+          </w:tcPr>
+          <w:p>
+            <w:r>
+              <w:rPr>
+                <w:rFonts w:ascii="맑은 고딕" w:hAnsi="맑은 고딕" w:eastAsia="맑은 고딕"/>
+                <w:b/>
+                <w:sz w:val="18"/>
+              </w:rPr>
+              <w:t>교체 때 0 으로 돌아가는 누적 카운터</w:t>
+            </w:r>
+            <w:r>
+              <w:rPr>
+                <w:rFonts w:ascii="맑은 고딕" w:hAnsi="맑은 고딕" w:eastAsia="맑은 고딕"/>
+                <w:sz w:val="18"/>
+              </w:rPr>
+              <w:t>로 확인(받은 로그 0 → 719). 1단계의 「그 행에서 친 횟수」 가정을 바꿈</w:t>
+            </w:r>
+          </w:p>
+        </w:tc>
+      </w:tr>
+      <w:tr>
+        <w:tc>
+          <w:tcPr>
+            <w:tcW w:type="dxa" w:w="2160"/>
+          </w:tcPr>
+          <w:p>
+            <w:r>
+              <w:rPr>
+                <w:rFonts w:ascii="맑은 고딕" w:hAnsi="맑은 고딕" w:eastAsia="맑은 고딕"/>
+                <w:sz w:val="18"/>
+              </w:rPr>
+              <w:t>일일 로그(가동 시간 포함)</w:t>
             </w:r>
           </w:p>
         </w:tc>
@@ -811,23 +929,7 @@
                 <w:rFonts w:ascii="맑은 고딕" w:hAnsi="맑은 고딕" w:eastAsia="맑은 고딕"/>
                 <w:sz w:val="18"/>
               </w:rPr>
-              <w:t>게시물 ③에는 있으나 ⑦ 샘플 목록에는 없음 — 따로 수집되는지 확인 필요</w:t>
-            </w:r>
-          </w:p>
-        </w:tc>
-      </w:tr>
-      <w:tr>
-        <w:tc>
-          <w:tcPr>
-            <w:tcW w:type="dxa" w:w="2160"/>
-          </w:tcPr>
-          <w:p>
-            <w:r>
-              <w:rPr>
-                <w:rFonts w:ascii="맑은 고딕" w:hAnsi="맑은 고딕" w:eastAsia="맑은 고딕"/>
-                <w:sz w:val="18"/>
-              </w:rPr>
-              <w:t>금형별 타수</w:t>
+              <w:t>하루 한 행</w:t>
             </w:r>
           </w:p>
         </w:tc>
@@ -841,35 +943,7 @@
                 <w:rFonts w:ascii="맑은 고딕" w:hAnsi="맑은 고딕" w:eastAsia="맑은 고딕"/>
                 <w:sz w:val="18"/>
               </w:rPr>
-              <w:t>미상</w:t>
-            </w:r>
-          </w:p>
-        </w:tc>
-        <w:tc>
-          <w:tcPr>
-            <w:tcW w:type="dxa" w:w="2160"/>
-          </w:tcPr>
-          <w:p>
-            <w:r>
-              <w:rPr>
-                <w:rFonts w:ascii="맑은 고딕" w:hAnsi="맑은 고딕" w:eastAsia="맑은 고딕"/>
-                <w:sz w:val="18"/>
-              </w:rPr>
-              <w:t>미상</w:t>
-            </w:r>
-          </w:p>
-        </w:tc>
-        <w:tc>
-          <w:tcPr>
-            <w:tcW w:type="dxa" w:w="2160"/>
-          </w:tcPr>
-          <w:p>
-            <w:r>
-              <w:rPr>
-                <w:rFonts w:ascii="맑은 고딕" w:hAnsi="맑은 고딕" w:eastAsia="맑은 고딕"/>
-                <w:sz w:val="18"/>
-              </w:rPr>
-              <w:t>「금형 타수」가 그날 친 횟수인지, 교체 때 0 으로 돌아가는 누적 카운터인지 확인 필요</w:t>
+              <w:t>1단계 형식. 계속 쓸 수 있게 두었고, 2초 로그는 하루 묶음으로 바꿔 같은 판정에 이어 붙임</w:t>
             </w:r>
           </w:p>
         </w:tc>
@@ -997,7 +1071,7 @@
         <w:rPr>
           <w:rFonts w:ascii="맑은 고딕" w:hAnsi="맑은 고딕" w:eastAsia="맑은 고딕"/>
         </w:rPr>
-        <w:t xml:space="preserve">첨부 파일이 없어, 1단계는 위 칸 이름 그대로 만든 </w:t>
+        <w:t xml:space="preserve">1단계는 첨부 파일이 없어 칸 이름 그대로 만든 </w:t>
       </w:r>
       <w:r>
         <w:rPr>
@@ -1010,7 +1084,15 @@
         <w:rPr>
           <w:rFonts w:ascii="맑은 고딕" w:hAnsi="맑은 고딕" w:eastAsia="맑은 고딕"/>
         </w:rPr>
-        <w:t>(프레스 P1~P4 × 90일, 금형 M-01~M-08)로 개발했습니다. 실제 로그를 받으면 열 연결만 맞춥니다.</w:t>
+        <w:t>(프레스 P1~P4 × 90일, 금형 M-01~M-08)로 개발했습니다.</w:t>
+      </w:r>
+    </w:p>
+    <w:p>
+      <w:r>
+        <w:rPr>
+          <w:rFonts w:ascii="맑은 고딕" w:hAnsi="맑은 고딕" w:eastAsia="맑은 고딕"/>
+        </w:rPr>
+        <w:t>2차에서 받은 로그 형식(2초 센서 로그)은 그대로 가져와지도록 맞췄고, 같은 형식의 가상 샘플(4대 × 3일)을 새로 만들었습니다(11장).</w:t>
       </w:r>
     </w:p>
     <w:p>
@@ -2653,7 +2735,40 @@
           <w:rFonts w:ascii="맑은 고딕" w:hAnsi="맑은 고딕" w:eastAsia="맑은 고딕"/>
           <w:b/>
         </w:rPr>
-        <w:t>샘플 데이터 (필수)</w:t>
+        <w:t>2차에서 풀린 것</w:t>
+      </w:r>
+      <w:r>
+        <w:rPr>
+          <w:rFonts w:ascii="맑은 고딕" w:hAnsi="맑은 고딕" w:eastAsia="맑은 고딕"/>
+        </w:rPr>
+        <w:t xml:space="preserve"> — 로그 견본(1번, 2초 로그 형식), 「금형 타수」의 뜻(4번, 교체 때 0 으로 돌아가는 누적), 진동 수집 여부(5번, 로그에 있음)</w:t>
+      </w:r>
+    </w:p>
+    <w:p>
+      <w:r>
+        <w:rPr>
+          <w:rFonts w:ascii="맑은 고딕" w:hAnsi="맑은 고딕" w:eastAsia="맑은 고딕"/>
+          <w:b/>
+        </w:rPr>
+        <w:t>샘플 데이터 (남은 것)</w:t>
+      </w:r>
+    </w:p>
+    <w:p>
+      <w:pPr>
+        <w:pStyle w:val="ListNumber"/>
+      </w:pPr>
+      <w:r>
+        <w:rPr>
+          <w:rFonts w:ascii="맑은 고딕" w:hAnsi="맑은 고딕" w:eastAsia="맑은 고딕"/>
+          <w:b/>
+        </w:rPr>
+        <w:t>관리 한계를 잡을 「정상 기준 구간」</w:t>
+      </w:r>
+      <w:r>
+        <w:rPr>
+          <w:rFonts w:ascii="맑은 고딕" w:hAnsi="맑은 고딕" w:eastAsia="맑은 고딕"/>
+        </w:rPr>
+        <w:t xml:space="preserve"> — 설비가 정상이던 날·시간대(예: 오버홀 직후 하루, 예열이 끝난 뒤). 지금은 처음 1시간(1,800개)을 기본으로 씁니다</w:t>
       </w:r>
     </w:p>
     <w:p>
@@ -2664,18 +2779,7 @@
         <w:rPr>
           <w:rFonts w:ascii="맑은 고딕" w:hAnsi="맑은 고딕" w:eastAsia="맑은 고딕"/>
         </w:rPr>
-        <w:t>실제 로그 견본 몇십 행 — 시각(또는 일자)·프레스·금형·타수·전류·전압·온도(·진동). 값을 가려도 됩니다. 한 행이 하루인지, 시각별(몇 분·몇 시간 간격)인지</w:t>
-      </w:r>
-    </w:p>
-    <w:p>
-      <w:pPr>
-        <w:pStyle w:val="ListNumber"/>
-      </w:pPr>
-      <w:r>
-        <w:rPr>
-          <w:rFonts w:ascii="맑은 고딕" w:hAnsi="맑은 고딕" w:eastAsia="맑은 고딕"/>
-        </w:rPr>
-        <w:t>고장·금형 교체·오버홀 이력 — 언제, 어느 프레스·금형, 무엇이 고장났는지(있는 만큼). 학습형 예지와 이상 감지 기준을 맞추는 데 꼭 필요합니다</w:t>
+        <w:t>고장·금형 교체·오버홀 이력 — 언제, 어느 프레스·금형, 무엇이 고장났는지(있는 만큼). ±3σ 이탈이 실제 고장 전에 나타났는지 맞춰 보는 데 꼭 필요합니다</w:t>
       </w:r>
     </w:p>
     <w:p>
@@ -2697,7 +2801,7 @@
         <w:rPr>
           <w:rFonts w:ascii="맑은 고딕" w:hAnsi="맑은 고딕" w:eastAsia="맑은 고딕"/>
         </w:rPr>
-        <w:t>「금형 타수」가 그날 친 횟수인지, 교체 때 0 으로 돌아가는 누적 카운터인지 / 「가동 시간」 단위(시간·분)</w:t>
+        <w:t>실제 설비 로그 하루치 이상(가능하면 며칠) — 받은 것은 모의 2시간이라 하루 안의 변화(예열·점심 정지·교대)와 날마다의 차이를 아직 못 봤습니다</w:t>
       </w:r>
     </w:p>
     <w:p>
@@ -2708,7 +2812,7 @@
         <w:rPr>
           <w:rFonts w:ascii="맑은 고딕" w:hAnsi="맑은 고딕" w:eastAsia="맑은 고딕"/>
         </w:rPr>
-        <w:t>진동은 따로 수집되는지(⑦ 샘플 목록에 없음), 어떤 값(RMS·피크, 단위)인지</w:t>
+        <w:t>진동 값이 RMS 인지 피크인지 · 정지 중에도 센서 값이 계속 들어오는지(정지 구간을 관리도에서 뺄지 정함) · 「10초에 1타」가 금형·제품마다 같은지</w:t>
       </w:r>
     </w:p>
     <w:p>
@@ -2728,7 +2832,7 @@
         <w:rPr>
           <w:rFonts w:ascii="맑은 고딕" w:hAnsi="맑은 고딕" w:eastAsia="맑은 고딕"/>
         </w:rPr>
-        <w:t>데이터를 어디서 꺼내는지 — PLC, 설비 화면 내보내기, 수기 엑셀 가운데 무엇이고, 얼마나 자주 꺼낼 수 있는지</w:t>
+        <w:t>데이터를 어디서 꺼내는지 — PLC, 설비 화면 내보내기, 수기 엑셀 가운데 무엇이고, 얼마나 자주 꺼낼 수 있는지(「실시간」을 몇 분 간격 파일로 볼지, 설비에서 바로 받아야 하는지)</w:t>
       </w:r>
     </w:p>
     <w:p>
@@ -2751,6 +2855,668 @@
           <w:rFonts w:ascii="맑은 고딕" w:hAnsi="맑은 고딕" w:eastAsia="맑은 고딕"/>
         </w:rPr>
         <w:t>외부 AI(ChatGPT 등)에 설비 로그 요약을 보내도 되는지, 회사에서 허용한 AI 가 있는지</w:t>
+      </w:r>
+    </w:p>
+    <w:p>
+      <w:pPr>
+        <w:pStyle w:val="Heading1"/>
+      </w:pPr>
+      <w:r>
+        <w:rPr>
+          <w:rFonts w:ascii="맑은 고딕" w:hAnsi="맑은 고딕" w:eastAsia="맑은 고딕"/>
+        </w:rPr>
+        <w:t>11. 2차 반영 내역 (2026-10-21)</w:t>
+      </w:r>
+    </w:p>
+    <w:p>
+      <w:r>
+        <w:rPr>
+          <w:rFonts w:ascii="맑은 고딕" w:hAnsi="맑은 고딕" w:eastAsia="맑은 고딕"/>
+        </w:rPr>
+        <w:t>수강생이 보낸 로그 샘플(2초 간격 모의 데이터 3,600행)과 요청 — 「전류·전압·온도·진동은 센서가 2초 단위로 보내고, 타수는 10초에 1타씩 오르는 로그다. 대시보드에 시각화하고 값마다 ±3σ 관리선으로 관리하고 싶다」 — 을 반영했습니다.</w:t>
+      </w:r>
+    </w:p>
+    <w:p>
+      <w:pPr>
+        <w:pStyle w:val="Heading2"/>
+      </w:pPr>
+      <w:r>
+        <w:rPr>
+          <w:rFonts w:ascii="맑은 고딕" w:hAnsi="맑은 고딕" w:eastAsia="맑은 고딕"/>
+        </w:rPr>
+        <w:t>11.1 받은 로그로 확인한 것</w:t>
+      </w:r>
+    </w:p>
+    <w:tbl>
+      <w:tblPr>
+        <w:tblStyle w:val="TableGrid"/>
+        <w:tblW w:type="auto" w:w="0"/>
+        <w:jc w:val="center"/>
+        <w:tblLook w:firstColumn="1" w:firstRow="1" w:lastColumn="0" w:lastRow="0" w:noHBand="0" w:noVBand="1" w:val="04A0"/>
+      </w:tblPr>
+      <w:tblGrid>
+        <w:gridCol w:w="4320"/>
+        <w:gridCol w:w="4320"/>
+      </w:tblGrid>
+      <w:tr>
+        <w:tc>
+          <w:tcPr>
+            <w:tcW w:type="dxa" w:w="4320"/>
+          </w:tcPr>
+          <w:p>
+            <w:r>
+              <w:rPr>
+                <w:rFonts w:ascii="맑은 고딕" w:hAnsi="맑은 고딕" w:eastAsia="맑은 고딕"/>
+                <w:b/>
+                <w:sz w:val="18"/>
+              </w:rPr>
+              <w:t>항목</w:t>
+            </w:r>
+          </w:p>
+        </w:tc>
+        <w:tc>
+          <w:tcPr>
+            <w:tcW w:type="dxa" w:w="4320"/>
+          </w:tcPr>
+          <w:p>
+            <w:r>
+              <w:rPr>
+                <w:rFonts w:ascii="맑은 고딕" w:hAnsi="맑은 고딕" w:eastAsia="맑은 고딕"/>
+                <w:b/>
+                <w:sz w:val="18"/>
+              </w:rPr>
+              <w:t>확인 결과</w:t>
+            </w:r>
+          </w:p>
+        </w:tc>
+      </w:tr>
+      <w:tr>
+        <w:tc>
+          <w:tcPr>
+            <w:tcW w:type="dxa" w:w="4320"/>
+          </w:tcPr>
+          <w:p>
+            <w:r>
+              <w:rPr>
+                <w:rFonts w:ascii="맑은 고딕" w:hAnsi="맑은 고딕" w:eastAsia="맑은 고딕"/>
+                <w:sz w:val="18"/>
+              </w:rPr>
+              <w:t>형식</w:t>
+            </w:r>
+          </w:p>
+        </w:tc>
+        <w:tc>
+          <w:tcPr>
+            <w:tcW w:type="dxa" w:w="4320"/>
+          </w:tcPr>
+          <w:p>
+            <w:r>
+              <w:rPr>
+                <w:rFonts w:ascii="맑은 고딕" w:hAnsi="맑은 고딕" w:eastAsia="맑은 고딕"/>
+                <w:sz w:val="18"/>
+              </w:rPr>
+              <w:t>CSV · UTF-8(BOM) · 모든 칸 따옴표 · 11열(「데이터 구분」 칸은 읽지 않음)</w:t>
+            </w:r>
+          </w:p>
+        </w:tc>
+      </w:tr>
+      <w:tr>
+        <w:tc>
+          <w:tcPr>
+            <w:tcW w:type="dxa" w:w="4320"/>
+          </w:tcPr>
+          <w:p>
+            <w:r>
+              <w:rPr>
+                <w:rFonts w:ascii="맑은 고딕" w:hAnsi="맑은 고딕" w:eastAsia="맑은 고딕"/>
+                <w:sz w:val="18"/>
+              </w:rPr>
+              <w:t>간격</w:t>
+            </w:r>
+          </w:p>
+        </w:tc>
+        <w:tc>
+          <w:tcPr>
+            <w:tcW w:type="dxa" w:w="4320"/>
+          </w:tcPr>
+          <w:p>
+            <w:r>
+              <w:rPr>
+                <w:rFonts w:ascii="맑은 고딕" w:hAnsi="맑은 고딕" w:eastAsia="맑은 고딕"/>
+                <w:sz w:val="18"/>
+              </w:rPr>
+              <w:t>일자 칸에 초까지(yyyy-mm-dd hh:mm:ss), 2초 간격 — 1대 하루 43,200행</w:t>
+            </w:r>
+          </w:p>
+        </w:tc>
+      </w:tr>
+      <w:tr>
+        <w:tc>
+          <w:tcPr>
+            <w:tcW w:type="dxa" w:w="4320"/>
+          </w:tcPr>
+          <w:p>
+            <w:r>
+              <w:rPr>
+                <w:rFonts w:ascii="맑은 고딕" w:hAnsi="맑은 고딕" w:eastAsia="맑은 고딕"/>
+                <w:sz w:val="18"/>
+              </w:rPr>
+              <w:t>타수</w:t>
+            </w:r>
+          </w:p>
+        </w:tc>
+        <w:tc>
+          <w:tcPr>
+            <w:tcW w:type="dxa" w:w="4320"/>
+          </w:tcPr>
+          <w:p>
+            <w:r>
+              <w:rPr>
+                <w:rFonts w:ascii="맑은 고딕" w:hAnsi="맑은 고딕" w:eastAsia="맑은 고딕"/>
+                <w:sz w:val="18"/>
+              </w:rPr>
+              <w:t>프레스 누적 타수가 10초에 1씩 오름(2시간 719타, 기준 720타의 99.9%)</w:t>
+            </w:r>
+          </w:p>
+        </w:tc>
+      </w:tr>
+      <w:tr>
+        <w:tc>
+          <w:tcPr>
+            <w:tcW w:type="dxa" w:w="4320"/>
+          </w:tcPr>
+          <w:p>
+            <w:r>
+              <w:rPr>
+                <w:rFonts w:ascii="맑은 고딕" w:hAnsi="맑은 고딕" w:eastAsia="맑은 고딕"/>
+                <w:sz w:val="18"/>
+              </w:rPr>
+              <w:t>금형 타수</w:t>
+            </w:r>
+          </w:p>
+        </w:tc>
+        <w:tc>
+          <w:tcPr>
+            <w:tcW w:type="dxa" w:w="4320"/>
+          </w:tcPr>
+          <w:p>
+            <w:r>
+              <w:rPr>
+                <w:rFonts w:ascii="맑은 고딕" w:hAnsi="맑은 고딕" w:eastAsia="맑은 고딕"/>
+                <w:sz w:val="18"/>
+              </w:rPr>
+              <w:t xml:space="preserve">0 에서 시작해 719 까지 오르는 </w:t>
+            </w:r>
+            <w:r>
+              <w:rPr>
+                <w:rFonts w:ascii="맑은 고딕" w:hAnsi="맑은 고딕" w:eastAsia="맑은 고딕"/>
+                <w:b/>
+                <w:sz w:val="18"/>
+              </w:rPr>
+              <w:t>누적 카운터</w:t>
+            </w:r>
+            <w:r>
+              <w:rPr>
+                <w:rFonts w:ascii="맑은 고딕" w:hAnsi="맑은 고딕" w:eastAsia="맑은 고딕"/>
+                <w:sz w:val="18"/>
+              </w:rPr>
+              <w:t xml:space="preserve"> — 1단계 가정(그 행에서 친 횟수)을 바꿈</w:t>
+            </w:r>
+          </w:p>
+        </w:tc>
+      </w:tr>
+      <w:tr>
+        <w:tc>
+          <w:tcPr>
+            <w:tcW w:type="dxa" w:w="4320"/>
+          </w:tcPr>
+          <w:p>
+            <w:r>
+              <w:rPr>
+                <w:rFonts w:ascii="맑은 고딕" w:hAnsi="맑은 고딕" w:eastAsia="맑은 고딕"/>
+                <w:sz w:val="18"/>
+              </w:rPr>
+              <w:t>센서 값</w:t>
+            </w:r>
+          </w:p>
+        </w:tc>
+        <w:tc>
+          <w:tcPr>
+            <w:tcW w:type="dxa" w:w="4320"/>
+          </w:tcPr>
+          <w:p>
+            <w:r>
+              <w:rPr>
+                <w:rFonts w:ascii="맑은 고딕" w:hAnsi="맑은 고딕" w:eastAsia="맑은 고딕"/>
+                <w:sz w:val="18"/>
+              </w:rPr>
+              <w:t>앞뒤 값이 거의 같음(자기상관 — 전류 0.96, 온도 0.99). 온도는 2시간 동안 약 1.2℃ 오름(예열로 보임)</w:t>
+            </w:r>
+          </w:p>
+        </w:tc>
+      </w:tr>
+    </w:tbl>
+    <w:p/>
+    <w:p>
+      <w:pPr>
+        <w:pStyle w:val="Heading2"/>
+      </w:pPr>
+      <w:r>
+        <w:rPr>
+          <w:rFonts w:ascii="맑은 고딕" w:hAnsi="맑은 고딕" w:eastAsia="맑은 고딕"/>
+        </w:rPr>
+        <w:t>11.2 반영한 기능</w:t>
+      </w:r>
+    </w:p>
+    <w:tbl>
+      <w:tblPr>
+        <w:tblStyle w:val="TableGrid"/>
+        <w:tblW w:type="auto" w:w="0"/>
+        <w:jc w:val="center"/>
+        <w:tblLook w:firstColumn="1" w:firstRow="1" w:lastColumn="0" w:lastRow="0" w:noHBand="0" w:noVBand="1" w:val="04A0"/>
+      </w:tblPr>
+      <w:tblGrid>
+        <w:gridCol w:w="4320"/>
+        <w:gridCol w:w="4320"/>
+      </w:tblGrid>
+      <w:tr>
+        <w:tc>
+          <w:tcPr>
+            <w:tcW w:type="dxa" w:w="4320"/>
+          </w:tcPr>
+          <w:p>
+            <w:r>
+              <w:rPr>
+                <w:rFonts w:ascii="맑은 고딕" w:hAnsi="맑은 고딕" w:eastAsia="맑은 고딕"/>
+                <w:b/>
+                <w:sz w:val="18"/>
+              </w:rPr>
+              <w:t>요청</w:t>
+            </w:r>
+          </w:p>
+        </w:tc>
+        <w:tc>
+          <w:tcPr>
+            <w:tcW w:type="dxa" w:w="4320"/>
+          </w:tcPr>
+          <w:p>
+            <w:r>
+              <w:rPr>
+                <w:rFonts w:ascii="맑은 고딕" w:hAnsi="맑은 고딕" w:eastAsia="맑은 고딕"/>
+                <w:b/>
+                <w:sz w:val="18"/>
+              </w:rPr>
+              <w:t>반영</w:t>
+            </w:r>
+          </w:p>
+        </w:tc>
+      </w:tr>
+      <w:tr>
+        <w:tc>
+          <w:tcPr>
+            <w:tcW w:type="dxa" w:w="4320"/>
+          </w:tcPr>
+          <w:p>
+            <w:r>
+              <w:rPr>
+                <w:rFonts w:ascii="맑은 고딕" w:hAnsi="맑은 고딕" w:eastAsia="맑은 고딕"/>
+                <w:sz w:val="18"/>
+              </w:rPr>
+              <w:t>이 CSV 를 그대로 가져오기</w:t>
+            </w:r>
+          </w:p>
+        </w:tc>
+        <w:tc>
+          <w:tcPr>
+            <w:tcW w:type="dxa" w:w="4320"/>
+          </w:tcPr>
+          <w:p>
+            <w:r>
+              <w:rPr>
+                <w:rFonts w:ascii="맑은 고딕" w:hAnsi="맑은 고딕" w:eastAsia="맑은 고딕"/>
+                <w:sz w:val="18"/>
+              </w:rPr>
+              <w:t>앞부분(512KB)으로 2초 로그인지 가리고, 맞으면 파일을 4MB 조각으로 나눠 끝까지 읽음(따옴표·BOM·조각 경계 처리, CP949 도 판별). 21MB(17만 행) 파일을 1.5초 안에 읽고 화면 멈춤은 0.4초 이하(헤드리스 실측). 같은 프레스·같은 시각은 한 번만 셈. 프레스마다 IndexedDB 에 저장</w:t>
+            </w:r>
+          </w:p>
+        </w:tc>
+      </w:tr>
+      <w:tr>
+        <w:tc>
+          <w:tcPr>
+            <w:tcW w:type="dxa" w:w="4320"/>
+          </w:tcPr>
+          <w:p>
+            <w:r>
+              <w:rPr>
+                <w:rFonts w:ascii="맑은 고딕" w:hAnsi="맑은 고딕" w:eastAsia="맑은 고딕"/>
+                <w:sz w:val="18"/>
+              </w:rPr>
+              <w:t>대시보드에 시각화</w:t>
+            </w:r>
+          </w:p>
+        </w:tc>
+        <w:tc>
+          <w:tcPr>
+            <w:tcW w:type="dxa" w:w="4320"/>
+          </w:tcPr>
+          <w:p>
+            <w:r>
+              <w:rPr>
+                <w:rFonts w:ascii="맑은 고딕" w:hAnsi="맑은 고딕" w:eastAsia="맑은 고딕"/>
+                <w:sz w:val="18"/>
+              </w:rPr>
+              <w:t>새 화면 「실시간 관리도」 — 프레스·금형·보는 구간(전체·최근 10분~하루·기간 지정) 고르기, 채널마다 마지막 값 카드, 전류·전압·온도·진동 관리도 4장. 대시보드 맨 위에 프레스별 「2초 센서 — 마지막 값」(최근 1시간 이탈·가동 중/정지)</w:t>
+            </w:r>
+          </w:p>
+        </w:tc>
+      </w:tr>
+      <w:tr>
+        <w:tc>
+          <w:tcPr>
+            <w:tcW w:type="dxa" w:w="4320"/>
+          </w:tcPr>
+          <w:p>
+            <w:r>
+              <w:rPr>
+                <w:rFonts w:ascii="맑은 고딕" w:hAnsi="맑은 고딕" w:eastAsia="맑은 고딕"/>
+                <w:sz w:val="18"/>
+              </w:rPr>
+              <w:t>값마다 ±3σ 관리선</w:t>
+            </w:r>
+          </w:p>
+        </w:tc>
+        <w:tc>
+          <w:tcPr>
+            <w:tcW w:type="dxa" w:w="4320"/>
+          </w:tcPr>
+          <w:p>
+            <w:r>
+              <w:rPr>
+                <w:rFonts w:ascii="맑은 고딕" w:hAnsi="맑은 고딕" w:eastAsia="맑은 고딕"/>
+                <w:sz w:val="18"/>
+              </w:rPr>
+              <w:t>Shewhart 관리도 — 중심선(기준 구간 평균), ±3σ 관리선(UCL·LCL), ±2σ 경고선(선택), 관리선 밖 점은 빨간 점. 점이 많으면 시간 칸마다 평균·최소·최대로 줄여 그리되 이탈점은 줄이지 않음</w:t>
+            </w:r>
+          </w:p>
+        </w:tc>
+      </w:tr>
+      <w:tr>
+        <w:tc>
+          <w:tcPr>
+            <w:tcW w:type="dxa" w:w="4320"/>
+          </w:tcPr>
+          <w:p>
+            <w:r>
+              <w:rPr>
+                <w:rFonts w:ascii="맑은 고딕" w:hAnsi="맑은 고딕" w:eastAsia="맑은 고딕"/>
+                <w:sz w:val="18"/>
+              </w:rPr>
+              <w:t>관리 한계 기준</w:t>
+            </w:r>
+          </w:p>
+        </w:tc>
+        <w:tc>
+          <w:tcPr>
+            <w:tcW w:type="dxa" w:w="4320"/>
+          </w:tcPr>
+          <w:p>
+            <w:r>
+              <w:rPr>
+                <w:rFonts w:ascii="맑은 고딕" w:hAnsi="맑은 고딕" w:eastAsia="맑은 고딕"/>
+                <w:sz w:val="18"/>
+              </w:rPr>
+              <w:t>기준 구간 = 처음 N개(기본 1,800개 = 1시간) 또는 기간 지정. σ = 표본 표준편차(기본) 또는 이동범위 MR̄/1.128(I-MR) — 화면에 기본값과 이유를 적음</w:t>
+            </w:r>
+          </w:p>
+        </w:tc>
+      </w:tr>
+      <w:tr>
+        <w:tc>
+          <w:tcPr>
+            <w:tcW w:type="dxa" w:w="4320"/>
+          </w:tcPr>
+          <w:p>
+            <w:r>
+              <w:rPr>
+                <w:rFonts w:ascii="맑은 고딕" w:hAnsi="맑은 고딕" w:eastAsia="맑은 고딕"/>
+                <w:sz w:val="18"/>
+              </w:rPr>
+              <w:t>이상 판정 규칙</w:t>
+            </w:r>
+          </w:p>
+        </w:tc>
+        <w:tc>
+          <w:tcPr>
+            <w:tcW w:type="dxa" w:w="4320"/>
+          </w:tcPr>
+          <w:p>
+            <w:r>
+              <w:rPr>
+                <w:rFonts w:ascii="맑은 고딕" w:hAnsi="맑은 고딕" w:eastAsia="맑은 고딕"/>
+                <w:sz w:val="18"/>
+              </w:rPr>
+              <w:t>1점 ±3σ 밖(늘) + 선택: 연속 9점 한쪽 · 연속 6점 증가·감소 · 3점 중 2점 ±2σ 밖. 이어진 이탈점은 한 번으로 묶어 목록(최근 것부터)·엑셀(이탈 목록·관리 한계·정지·금형 리셋·시간별 타수)</w:t>
+            </w:r>
+          </w:p>
+        </w:tc>
+      </w:tr>
+      <w:tr>
+        <w:tc>
+          <w:tcPr>
+            <w:tcW w:type="dxa" w:w="4320"/>
+          </w:tcPr>
+          <w:p>
+            <w:r>
+              <w:rPr>
+                <w:rFonts w:ascii="맑은 고딕" w:hAnsi="맑은 고딕" w:eastAsia="맑은 고딕"/>
+                <w:sz w:val="18"/>
+              </w:rPr>
+              <w:t>10초에 1타</w:t>
+            </w:r>
+          </w:p>
+        </w:tc>
+        <w:tc>
+          <w:tcPr>
+            <w:tcW w:type="dxa" w:w="4320"/>
+          </w:tcPr>
+          <w:p>
+            <w:r>
+              <w:rPr>
+                <w:rFonts w:ascii="맑은 고딕" w:hAnsi="맑은 고딕" w:eastAsia="맑은 고딕"/>
+                <w:sz w:val="18"/>
+              </w:rPr>
+              <w:t>누적 타수 차이로 타수·시간당 타수·기준(10초 1타) 대비·시간 가동률, 60초 넘게 타수가 안 오르면 정지 구간, 30초 넘게 기록이 없으면 기록 끊김, 금형명이 바뀌거나 금형 타수가 줄면 「금형 리셋(교체)」</w:t>
+            </w:r>
+          </w:p>
+        </w:tc>
+      </w:tr>
+      <w:tr>
+        <w:tc>
+          <w:tcPr>
+            <w:tcW w:type="dxa" w:w="4320"/>
+          </w:tcPr>
+          <w:p>
+            <w:r>
+              <w:rPr>
+                <w:rFonts w:ascii="맑은 고딕" w:hAnsi="맑은 고딕" w:eastAsia="맑은 고딕"/>
+                <w:sz w:val="18"/>
+              </w:rPr>
+              <w:t>기존 일 단위 판정</w:t>
+            </w:r>
+          </w:p>
+        </w:tc>
+        <w:tc>
+          <w:tcPr>
+            <w:tcW w:type="dxa" w:w="4320"/>
+          </w:tcPr>
+          <w:p>
+            <w:r>
+              <w:rPr>
+                <w:rFonts w:ascii="맑은 고딕" w:hAnsi="맑은 고딕" w:eastAsia="맑은 고딕"/>
+                <w:sz w:val="18"/>
+              </w:rPr>
+              <w:t>2초 로그를 프레스·날짜·금형마다 하루 한 행(타수 합·가동 시간·정지 아닌 값의 평균)으로 묶어 기존 금형 수명·오버홀·「최근 14일 vs 앞 42일, ±3σ 3일 연속」 판정과 월별 보고서에 이어 붙임</w:t>
+            </w:r>
+          </w:p>
+        </w:tc>
+      </w:tr>
+    </w:tbl>
+    <w:p/>
+    <w:p>
+      <w:pPr>
+        <w:pStyle w:val="Heading2"/>
+      </w:pPr>
+      <w:r>
+        <w:rPr>
+          <w:rFonts w:ascii="맑은 고딕" w:hAnsi="맑은 고딕" w:eastAsia="맑은 고딕"/>
+        </w:rPr>
+        <w:t>11.3 기본값과 그 이유</w:t>
+      </w:r>
+    </w:p>
+    <w:p>
+      <w:pPr>
+        <w:pStyle w:val="ListBullet"/>
+      </w:pPr>
+      <w:r>
+        <w:rPr>
+          <w:rFonts w:ascii="맑은 고딕" w:hAnsi="맑은 고딕" w:eastAsia="맑은 고딕"/>
+          <w:b/>
+        </w:rPr>
+        <w:t>σ 는 표본 표준편차가 기본입니다.</w:t>
+      </w:r>
+      <w:r>
+        <w:rPr>
+          <w:rFonts w:ascii="맑은 고딕" w:hAnsi="맑은 고딕" w:eastAsia="맑은 고딕"/>
+        </w:rPr>
+        <w:t xml:space="preserve"> 하나씩 재는 값의 표준 관리도(I-MR)는 이동범위(MR̄/1.128)로 σ 를 잡지만, 2초 값은 앞뒤가 거의 같아 이동범위가 아주 작게 나옵니다. 받은 로그로 재 보니 이동범위 방식은 처음 1시간 기준으로 온도 3,425점·전류 2,520점(3,600점 중)이 관리선 밖이었고, 표본 표준편차는 0점이었습니다.</w:t>
+      </w:r>
+    </w:p>
+    <w:p>
+      <w:pPr>
+        <w:pStyle w:val="ListBullet"/>
+      </w:pPr>
+      <w:r>
+        <w:rPr>
+          <w:rFonts w:ascii="맑은 고딕" w:hAnsi="맑은 고딕" w:eastAsia="맑은 고딕"/>
+          <w:b/>
+        </w:rPr>
+        <w:t>「연속 9점 한쪽」 같은 추가 규칙은 기본은 끔.</w:t>
+      </w:r>
+      <w:r>
+        <w:rPr>
+          <w:rFonts w:ascii="맑은 고딕" w:hAnsi="맑은 고딕" w:eastAsia="맑은 고딕"/>
+        </w:rPr>
+        <w:t xml:space="preserve"> 같은 이유로 2초 값에서는 정상이어도 아주 자주 걸립니다(받은 로그 전류 3,600점 중 3,086점). 「1분 평균」으로 묶어 볼 때 켜면 평균이 옮겨 간 것을 잡습니다(샘플 P4 전압).</w:t>
+      </w:r>
+    </w:p>
+    <w:p>
+      <w:pPr>
+        <w:pStyle w:val="ListBullet"/>
+      </w:pPr>
+      <w:r>
+        <w:rPr>
+          <w:rFonts w:ascii="맑은 고딕" w:hAnsi="맑은 고딕" w:eastAsia="맑은 고딕"/>
+          <w:b/>
+        </w:rPr>
+        <w:t>정지 구간 값은 관리도에서 뺌(기본).</w:t>
+      </w:r>
+      <w:r>
+        <w:rPr>
+          <w:rFonts w:ascii="맑은 고딕" w:hAnsi="맑은 고딕" w:eastAsia="맑은 고딕"/>
+        </w:rPr>
+        <w:t xml:space="preserve"> 정지하면 전류·진동이 떨어져 늘 이탈로 나오기 때문입니다. 정지 구간은 따로 표로 보입니다.</w:t>
+      </w:r>
+    </w:p>
+    <w:p>
+      <w:pPr>
+        <w:pStyle w:val="ListBullet"/>
+      </w:pPr>
+      <w:r>
+        <w:rPr>
+          <w:rFonts w:ascii="맑은 고딕" w:hAnsi="맑은 고딕" w:eastAsia="맑은 고딕"/>
+          <w:b/>
+        </w:rPr>
+        <w:t>2초 원값은 정상이어도 370개에 1개꼴(약 12분에 한 번) ±3σ 를 넘습니다.</w:t>
+      </w:r>
+      <w:r>
+        <w:rPr>
+          <w:rFonts w:ascii="맑은 고딕" w:hAnsi="맑은 고딕" w:eastAsia="맑은 고딕"/>
+        </w:rPr>
+        <w:t xml:space="preserve"> 그래서 이어진 이탈점을 한 번으로 묶고, 「1분 평균·5분 평균」으로 묶어 보는 보기를 두었습니다.</w:t>
+      </w:r>
+    </w:p>
+    <w:p>
+      <w:pPr>
+        <w:pStyle w:val="Heading2"/>
+      </w:pPr>
+      <w:r>
+        <w:rPr>
+          <w:rFonts w:ascii="맑은 고딕" w:hAnsi="맑은 고딕" w:eastAsia="맑은 고딕"/>
+        </w:rPr>
+        <w:t>11.4 가상 샘플(2초 로그)</w:t>
+      </w:r>
+    </w:p>
+    <w:p>
+      <w:r>
+        <w:rPr>
+          <w:rFonts w:ascii="맑은 고딕" w:hAnsi="맑은 고딕" w:eastAsia="맑은 고딕"/>
+        </w:rPr>
+        <w:t>받은 로그와 같은 형식(11열·따옴표)으로 새로 만든 값입니다(리포에는 수강생 파일을 두지 않음). 프레스 P1~P4 × 2026-10-19~21 × 08~12시·13~17시 = 172,350행(화면의 「2초 로그 샘플」 버튼), 내려받기 파일은 10/21 오후 4대 28,800행.</w:t>
+      </w:r>
+    </w:p>
+    <w:p>
+      <w:r>
+        <w:rPr>
+          <w:rFonts w:ascii="맑은 고딕" w:hAnsi="맑은 고딕" w:eastAsia="맑은 고딕"/>
+        </w:rPr>
+        <w:t>심어 둔 것: P2 10/21 오후 전류·온도 상승(±3σ 이탈) · P3 10/20 10:00 20분 정지 · P3 10/21 14시대 진동 튐 · P4 10/20 13:00 금형 M-07→M-08 교체(금형 타수 0) · P4 10/21 오후 전압이 조금 내려앉음(1분 평균·연속 9점 규칙으로 보임) · P1 10/20 15:10 기록 15분 끊김.</w:t>
+      </w:r>
+    </w:p>
+    <w:p>
+      <w:pPr>
+        <w:pStyle w:val="Heading2"/>
+      </w:pPr>
+      <w:r>
+        <w:rPr>
+          <w:rFonts w:ascii="맑은 고딕" w:hAnsi="맑은 고딕" w:eastAsia="맑은 고딕"/>
+        </w:rPr>
+        <w:t>11.5 남은 것</w:t>
+      </w:r>
+    </w:p>
+    <w:p>
+      <w:pPr>
+        <w:pStyle w:val="ListBullet"/>
+      </w:pPr>
+      <w:r>
+        <w:rPr>
+          <w:rFonts w:ascii="맑은 고딕" w:hAnsi="맑은 고딕" w:eastAsia="맑은 고딕"/>
+        </w:rPr>
+        <w:t xml:space="preserve">「실시간」은 지금 </w:t>
+      </w:r>
+      <w:r>
+        <w:rPr>
+          <w:rFonts w:ascii="맑은 고딕" w:hAnsi="맑은 고딕" w:eastAsia="맑은 고딕"/>
+          <w:b/>
+        </w:rPr>
+        <w:t>파일을 넣을 때마다 갱신</w:t>
+      </w:r>
+      <w:r>
+        <w:rPr>
+          <w:rFonts w:ascii="맑은 고딕" w:hAnsi="맑은 고딕" w:eastAsia="맑은 고딕"/>
+        </w:rPr>
+        <w:t>입니다(최근 N분 = 로그 마지막 시각 기준). 설비에서 2초마다 바로 받으려면 수집 서버(또는 Supabase)와 협력사 공유를 2단계에서 함께 만듭니다(10장 6·7번).</w:t>
+      </w:r>
+    </w:p>
+    <w:p>
+      <w:pPr>
+        <w:pStyle w:val="ListBullet"/>
+      </w:pPr>
+      <w:r>
+        <w:rPr>
+          <w:rFonts w:ascii="맑은 고딕" w:hAnsi="맑은 고딕" w:eastAsia="맑은 고딕"/>
+        </w:rPr>
+        <w:t>관리 한계를 잡을 정상 기준 구간과 고장 이력을 받으면, 이탈이 실제 고장 전에 나타났는지 맞춰 보고 규칙·묶음 간격을 정합니다(10장 1·2번).</w:t>
       </w:r>
     </w:p>
     <w:sectPr>

</xml_diff>